<commit_message>
Update Replenix Journal validation with True Oracle evaluation insights
</commit_message>
<xml_diff>
--- a/experiments/realworld_replenix_live/Replenix_Journal_Validation.docx
+++ b/experiments/realworld_replenix_live/Replenix_Journal_Validation.docx
@@ -122,7 +122,7 @@
           </w:tcPr>
           <w:p>
             <w:r>
-              <w:t>100.00%</w:t>
+              <w:t>99.68%</w:t>
             </w:r>
           </w:p>
         </w:tc>
@@ -132,7 +132,7 @@
           </w:tcPr>
           <w:p>
             <w:r>
-              <w:t>99.93%</w:t>
+              <w:t>99.77%</w:t>
             </w:r>
           </w:p>
         </w:tc>
@@ -142,7 +142,7 @@
           </w:tcPr>
           <w:p>
             <w:r>
-              <w:t>18195280</w:t>
+              <w:t>17683325</w:t>
             </w:r>
           </w:p>
         </w:tc>
@@ -152,7 +152,7 @@
           </w:tcPr>
           <w:p>
             <w:r>
-              <w:t>17387605</w:t>
+              <w:t>20140800</w:t>
             </w:r>
           </w:p>
         </w:tc>
@@ -174,7 +174,7 @@
           </w:tcPr>
           <w:p>
             <w:r>
-              <w:t>100.00%</w:t>
+              <w:t>99.87%</w:t>
             </w:r>
           </w:p>
         </w:tc>
@@ -184,7 +184,7 @@
           </w:tcPr>
           <w:p>
             <w:r>
-              <w:t>97.81%</w:t>
+              <w:t>99.77%</w:t>
             </w:r>
           </w:p>
         </w:tc>
@@ -194,7 +194,7 @@
           </w:tcPr>
           <w:p>
             <w:r>
-              <w:t>18582220</w:t>
+              <w:t>18736285</w:t>
             </w:r>
           </w:p>
         </w:tc>
@@ -204,7 +204,7 @@
           </w:tcPr>
           <w:p>
             <w:r>
-              <w:t>17914485</w:t>
+              <w:t>20321135</w:t>
             </w:r>
           </w:p>
         </w:tc>
@@ -335,7 +335,7 @@
           </w:tcPr>
           <w:p>
             <w:r>
-              <w:t>98.43%</w:t>
+              <w:t>72.13%</w:t>
             </w:r>
           </w:p>
         </w:tc>
@@ -345,7 +345,7 @@
           </w:tcPr>
           <w:p>
             <w:r>
-              <w:t>70.75%</w:t>
+              <w:t>93.30%</w:t>
             </w:r>
           </w:p>
         </w:tc>
@@ -355,7 +355,7 @@
           </w:tcPr>
           <w:p>
             <w:r>
-              <w:t>9599434</w:t>
+              <w:t>1459444</w:t>
             </w:r>
           </w:p>
         </w:tc>
@@ -365,7 +365,7 @@
           </w:tcPr>
           <w:p>
             <w:r>
-              <w:t>1281182</w:t>
+              <w:t>8630894</w:t>
             </w:r>
           </w:p>
         </w:tc>
@@ -397,7 +397,7 @@
           </w:tcPr>
           <w:p>
             <w:r>
-              <w:t>85.06%</w:t>
+              <w:t>91.27%</w:t>
             </w:r>
           </w:p>
         </w:tc>
@@ -407,7 +407,7 @@
           </w:tcPr>
           <w:p>
             <w:r>
-              <w:t>2286548</w:t>
+              <w:t>2585558</w:t>
             </w:r>
           </w:p>
         </w:tc>
@@ -417,7 +417,7 @@
           </w:tcPr>
           <w:p>
             <w:r>
-              <w:t>1516422</w:t>
+              <w:t>2162583</w:t>
             </w:r>
           </w:p>
         </w:tc>

</xml_diff>